<commit_message>
v2.0: Material actualizado con enfoque Colombia
Mejoras principales:
- Módulo 1 reescrito: Sistema ferroviario colombiano actual (Metro Medellín,
  Metro Bogotá, RegioTram, corredores de carga)
- Marco normativo colombiano completo (Ley 1523, Ley 1682, Decreto 1609, etc.)
- Entidades reguladoras colombianas (ANI, Supertransporte, UNGRD, etc.)
- Números de emergencia Colombia (123, 119, 132, 144, 112)
- Coordinación con SNGRD, CMGRD, CDGRD, CRUE
- Protocolos adaptados: deslizamientos, temporada de lluvias, zonas rurales
- MATPEL enfocado en carbón (principal carga ferroviaria colombiana)
- Caso de estudio #5: Pasos a nivel en Colombia
- Escenarios de simulacro contextualizados (Cesar, Medellín, Magdalena Medio)
- Guía rápida actualizada con datos Colombia
- Archivos Word (.docx) regenerados
</commit_message>
<xml_diff>
--- a/GUIA_RAPIDA_PROTOCOLOS_EMERGENCIA.docx
+++ b/GUIA_RAPIDA_PROTOCOLOS_EMERGENCIA.docx
@@ -15,6 +15,14 @@
         <w:pStyle w:val="Heading2"/>
       </w:pPr>
       <w:r>
+        <w:t xml:space="preserve">COLOMBIA</w:t>
+      </w:r>
+    </w:p>
+    <w:p>
+      <w:pPr>
+        <w:pStyle w:val="Heading3"/>
+      </w:pPr>
+      <w:r>
         <w:t xml:space="preserve">(Material de bolsillo para personal operativo)</w:t>
       </w:r>
     </w:p>
@@ -42,7 +50,7 @@
           <w:i/>
           <w:color w:val="555555"/>
         </w:rPr>
-        <w:t xml:space="preserve">    ⚠️ ESTE DOCUMENTO DEBE ESTAR ACCESIBLE EN TODO MOMENTO DURANTE EL SERVICIO</w:t>
+        <w:t xml:space="preserve">    ESTE DOCUMENTO DEBE ESTAR ACCESIBLE EN TODO MOMENTO DURANTE EL SERVICIO</w:t>
       </w:r>
     </w:p>
     <w:p>
@@ -195,7 +203,7 @@
               <w:rPr>
                 <w:sz w:val="20"/>
               </w:rPr>
-              <w:t xml:space="preserve">Notifique al CCO inmediatamente</w:t>
+              <w:t xml:space="preserve">Notifique al CCO + Línea 123 si hay víctimas</w:t>
             </w:r>
           </w:p>
         </w:tc>
@@ -291,7 +299,7 @@
               <w:rPr>
                 <w:sz w:val="20"/>
               </w:rPr>
-              <w:t xml:space="preserve">Aguarde refuerzos o inicie evacuación si hay peligro</w:t>
+              <w:t xml:space="preserve">Aguarde organismos de socorro o inicie evacuación</w:t>
             </w:r>
           </w:p>
         </w:tc>
@@ -325,7 +333,7 @@
         <w:pStyle w:val="Heading2"/>
       </w:pPr>
       <w:r>
-        <w:t xml:space="preserve">NÚMEROS DE EMERGENCIA</w:t>
+        <w:t xml:space="preserve">NÚMEROS DE EMERGENCIA - COLOMBIA</w:t>
       </w:r>
     </w:p>
     <w:p>
@@ -373,19 +381,173 @@
                 <w:color w:val="FFFFFF"/>
                 <w:sz w:val="20"/>
               </w:rPr>
-              <w:t xml:space="preserve">Teléfono</w:t>
-            </w:r>
-          </w:p>
-        </w:tc>
-      </w:tr>
-      <w:tr>
-        <w:tc>
-          <w:p>
-            <w:r>
-              <w:rPr>
-                <w:sz w:val="20"/>
-              </w:rPr>
-              <w:t xml:space="preserve">Centro de Control de Operaciones (CCO)</w:t>
+              <w:t xml:space="preserve">Número</w:t>
+            </w:r>
+          </w:p>
+        </w:tc>
+      </w:tr>
+      <w:tr>
+        <w:tc>
+          <w:p>
+            <w:r>
+              <w:rPr>
+                <w:sz w:val="20"/>
+              </w:rPr>
+              <w:t xml:space="preserve">**Número Único de Emergencias (NUSE)**</w:t>
+            </w:r>
+          </w:p>
+        </w:tc>
+        <w:tc>
+          <w:p>
+            <w:r>
+              <w:rPr>
+                <w:sz w:val="20"/>
+              </w:rPr>
+              <w:t xml:space="preserve">**123**</w:t>
+            </w:r>
+          </w:p>
+        </w:tc>
+      </w:tr>
+      <w:tr>
+        <w:tc>
+          <w:p>
+            <w:r>
+              <w:rPr>
+                <w:sz w:val="20"/>
+              </w:rPr>
+              <w:t xml:space="preserve">Bomberos</w:t>
+            </w:r>
+          </w:p>
+        </w:tc>
+        <w:tc>
+          <w:p>
+            <w:r>
+              <w:rPr>
+                <w:sz w:val="20"/>
+              </w:rPr>
+              <w:t xml:space="preserve">**119**</w:t>
+            </w:r>
+          </w:p>
+        </w:tc>
+      </w:tr>
+      <w:tr>
+        <w:tc>
+          <w:p>
+            <w:r>
+              <w:rPr>
+                <w:sz w:val="20"/>
+              </w:rPr>
+              <w:t xml:space="preserve">Policía Nacional</w:t>
+            </w:r>
+          </w:p>
+        </w:tc>
+        <w:tc>
+          <w:p>
+            <w:r>
+              <w:rPr>
+                <w:sz w:val="20"/>
+              </w:rPr>
+              <w:t xml:space="preserve">**112**</w:t>
+            </w:r>
+          </w:p>
+        </w:tc>
+      </w:tr>
+      <w:tr>
+        <w:tc>
+          <w:p>
+            <w:r>
+              <w:rPr>
+                <w:sz w:val="20"/>
+              </w:rPr>
+              <w:t xml:space="preserve">Cruz Roja Colombiana</w:t>
+            </w:r>
+          </w:p>
+        </w:tc>
+        <w:tc>
+          <w:p>
+            <w:r>
+              <w:rPr>
+                <w:sz w:val="20"/>
+              </w:rPr>
+              <w:t xml:space="preserve">**132**</w:t>
+            </w:r>
+          </w:p>
+        </w:tc>
+      </w:tr>
+      <w:tr>
+        <w:tc>
+          <w:p>
+            <w:r>
+              <w:rPr>
+                <w:sz w:val="20"/>
+              </w:rPr>
+              <w:t xml:space="preserve">Defensa Civil</w:t>
+            </w:r>
+          </w:p>
+        </w:tc>
+        <w:tc>
+          <w:p>
+            <w:r>
+              <w:rPr>
+                <w:sz w:val="20"/>
+              </w:rPr>
+              <w:t xml:space="preserve">**144**</w:t>
+            </w:r>
+          </w:p>
+        </w:tc>
+      </w:tr>
+      <w:tr>
+        <w:tc>
+          <w:p>
+            <w:r>
+              <w:rPr>
+                <w:sz w:val="20"/>
+              </w:rPr>
+              <w:t xml:space="preserve">Tránsito y Transporte</w:t>
+            </w:r>
+          </w:p>
+        </w:tc>
+        <w:tc>
+          <w:p>
+            <w:r>
+              <w:rPr>
+                <w:sz w:val="20"/>
+              </w:rPr>
+              <w:t xml:space="preserve">**#767**</w:t>
+            </w:r>
+          </w:p>
+        </w:tc>
+      </w:tr>
+      <w:tr>
+        <w:tc>
+          <w:p>
+            <w:r>
+              <w:rPr>
+                <w:sz w:val="20"/>
+              </w:rPr>
+              <w:t xml:space="preserve">Emergencias Ambientales</w:t>
+            </w:r>
+          </w:p>
+        </w:tc>
+        <w:tc>
+          <w:p>
+            <w:r>
+              <w:rPr>
+                <w:sz w:val="20"/>
+              </w:rPr>
+              <w:t xml:space="preserve">**018000-916112**</w:t>
+            </w:r>
+          </w:p>
+        </w:tc>
+      </w:tr>
+      <w:tr>
+        <w:tc>
+          <w:p>
+            <w:r>
+              <w:rPr>
+                <w:sz w:val="20"/>
+              </w:rPr>
+              <w:t xml:space="preserve">Centro Control Operaciones (CCO)</w:t>
             </w:r>
           </w:p>
         </w:tc>
@@ -407,7 +569,7 @@
               <w:rPr>
                 <w:sz w:val="20"/>
               </w:rPr>
-              <w:t xml:space="preserve">Emergencias general (112/911)</w:t>
+              <w:t xml:space="preserve">Supervisor de guardia</w:t>
             </w:r>
           </w:p>
         </w:tc>
@@ -429,95 +591,7 @@
               <w:rPr>
                 <w:sz w:val="20"/>
               </w:rPr>
-              <w:t xml:space="preserve">Bomberos</w:t>
-            </w:r>
-          </w:p>
-        </w:tc>
-        <w:tc>
-          <w:p>
-            <w:r>
-              <w:rPr>
-                <w:sz w:val="20"/>
-              </w:rPr>
-              <w:t xml:space="preserve">_____________</w:t>
-            </w:r>
-          </w:p>
-        </w:tc>
-      </w:tr>
-      <w:tr>
-        <w:tc>
-          <w:p>
-            <w:r>
-              <w:rPr>
-                <w:sz w:val="20"/>
-              </w:rPr>
-              <w:t xml:space="preserve">Policía</w:t>
-            </w:r>
-          </w:p>
-        </w:tc>
-        <w:tc>
-          <w:p>
-            <w:r>
-              <w:rPr>
-                <w:sz w:val="20"/>
-              </w:rPr>
-              <w:t xml:space="preserve">_____________</w:t>
-            </w:r>
-          </w:p>
-        </w:tc>
-      </w:tr>
-      <w:tr>
-        <w:tc>
-          <w:p>
-            <w:r>
-              <w:rPr>
-                <w:sz w:val="20"/>
-              </w:rPr>
-              <w:t xml:space="preserve">Ambulancias</w:t>
-            </w:r>
-          </w:p>
-        </w:tc>
-        <w:tc>
-          <w:p>
-            <w:r>
-              <w:rPr>
-                <w:sz w:val="20"/>
-              </w:rPr>
-              <w:t xml:space="preserve">_____________</w:t>
-            </w:r>
-          </w:p>
-        </w:tc>
-      </w:tr>
-      <w:tr>
-        <w:tc>
-          <w:p>
-            <w:r>
-              <w:rPr>
-                <w:sz w:val="20"/>
-              </w:rPr>
-              <w:t xml:space="preserve">Supervisor de guardia</w:t>
-            </w:r>
-          </w:p>
-        </w:tc>
-        <w:tc>
-          <w:p>
-            <w:r>
-              <w:rPr>
-                <w:sz w:val="20"/>
-              </w:rPr>
-              <w:t xml:space="preserve">_____________</w:t>
-            </w:r>
-          </w:p>
-        </w:tc>
-      </w:tr>
-      <w:tr>
-        <w:tc>
-          <w:p>
-            <w:r>
-              <w:rPr>
-                <w:sz w:val="20"/>
-              </w:rPr>
-              <w:t xml:space="preserve">Equipo HAZMAT</w:t>
+              <w:t xml:space="preserve">CRUE departamental</w:t>
             </w:r>
           </w:p>
         </w:tc>
@@ -557,11 +631,16 @@
       </w:r>
     </w:p>
     <w:p>
+      <w:r>
+        <w:t xml:space="preserve"/>
+      </w:r>
+    </w:p>
+    <w:p>
       <w:pPr>
         <w:pStyle w:val="Heading2"/>
       </w:pPr>
       <w:r>
-        <w:t xml:space="preserve">FORMATO DE REPORTE AL CCO</w:t>
+        <w:t xml:space="preserve">FORMATO DE REPORTE AL CCO / LÍNEA 123</w:t>
       </w:r>
     </w:p>
     <w:p>
@@ -575,14 +654,17 @@
           <w:color w:val="333333"/>
           <w:sz w:val="18"/>
         </w:rPr>
-        <w:t xml:space="preserve">"CCO, aquí [su identificación], EMERGENCIA"
+        <w:t xml:space="preserve">"CCO / Línea 123, reporto EMERGENCIA FERROVIARIA"
 1. QUÉ pasó: _________________________________
-2. DÓNDE: Km ___, Vía ___, entre _____ y _____
+2. DÓNDE: Km ___, Corredor ___, Municipio ___,
+   Departamento ___
+   (GPS si disponible: Lat ___ Long ___)
 3. CUÁNDO: Hora ___:___
 4. MAGNITUD: ___ vagones/coches afectados
 5. VÍCTIMAS: Sí/No - Estimación: ___
-6. NECESIDADES: Ambulancias/Bomberos/HAZMAT/Grúa
-7. RIESGOS: _________________________________
+6. NECESIDADES: Ambulancias/Bomberos/MATPEL/Grúa
+7. ACCESO: Cómo llegar al sitio _______________
+8. RIESGOS adicionales: _______________________
 "Solicito acuse de recibo"</w:t>
       </w:r>
     </w:p>
@@ -597,11 +679,6 @@
           <w:color w:val="CCCCCC"/>
         </w:rPr>
         <w:t xml:space="preserve">────────────────────────────────────────────────────────────</w:t>
-      </w:r>
-    </w:p>
-    <w:p>
-      <w:r>
-        <w:t xml:space="preserve"/>
       </w:r>
     </w:p>
     <w:p>
@@ -763,7 +840,7 @@
               <w:rPr>
                 <w:sz w:val="20"/>
               </w:rPr>
-              <w:t xml:space="preserve">Reportar al CCO (km, vía, vagones afectados)</w:t>
+              <w:t xml:space="preserve">Reportar al CCO (km, corredor, vagones)</w:t>
             </w:r>
           </w:p>
         </w:tc>
@@ -807,7 +884,7 @@
               <w:rPr>
                 <w:sz w:val="20"/>
               </w:rPr>
-              <w:t xml:space="preserve">Evaluar necesidad de evacuación</w:t>
+              <w:t xml:space="preserve">Llamar Línea 123 si hay víctimas</w:t>
             </w:r>
           </w:p>
         </w:tc>
@@ -829,7 +906,7 @@
               <w:rPr>
                 <w:sz w:val="20"/>
               </w:rPr>
-              <w:t xml:space="preserve">Proteger zona: señales a 800m (convencional) / 2000m (alta velocidad)</w:t>
+              <w:t xml:space="preserve">Proteger zona: 800m en cada dirección</w:t>
             </w:r>
           </w:p>
         </w:tc>
@@ -851,7 +928,29 @@
               <w:rPr>
                 <w:sz w:val="20"/>
               </w:rPr>
-              <w:t xml:space="preserve">Esperar equipos de emergencia</w:t>
+              <w:t xml:space="preserve">Esperar organismos de socorro</w:t>
+            </w:r>
+          </w:p>
+        </w:tc>
+      </w:tr>
+      <w:tr>
+        <w:tc>
+          <w:p>
+            <w:r>
+              <w:rPr>
+                <w:sz w:val="20"/>
+              </w:rPr>
+              <w:t xml:space="preserve">9</w:t>
+            </w:r>
+          </w:p>
+        </w:tc>
+        <w:tc>
+          <w:p>
+            <w:r>
+              <w:rPr>
+                <w:sz w:val="20"/>
+              </w:rPr>
+              <w:t xml:space="preserve">Notificar a Supertransporte/ANI</w:t>
             </w:r>
           </w:p>
         </w:tc>
@@ -977,7 +1076,7 @@
               <w:rPr>
                 <w:sz w:val="20"/>
               </w:rPr>
-              <w:t xml:space="preserve">Detener tren EN ZONA ABIERTA (¡NUNCA en túnel!)</w:t>
+              <w:t xml:space="preserve">Detener tren EN ZONA ABIERTA (NUNCA en túnel!)</w:t>
             </w:r>
           </w:p>
         </w:tc>
@@ -999,7 +1098,7 @@
               <w:rPr>
                 <w:sz w:val="20"/>
               </w:rPr>
-              <w:t xml:space="preserve">Notificar al CCO</w:t>
+              <w:t xml:space="preserve">Reportar CCO + Bomberos (119)</w:t>
             </w:r>
           </w:p>
         </w:tc>
@@ -1021,7 +1120,7 @@
               <w:rPr>
                 <w:sz w:val="20"/>
               </w:rPr>
-              <w:t xml:space="preserve">Si es controlable: usar extintores (apuntar a la base del fuego)</w:t>
+              <w:t xml:space="preserve">Si controlable: usar extintores (base del fuego)</w:t>
             </w:r>
           </w:p>
         </w:tc>
@@ -1043,7 +1142,7 @@
               <w:rPr>
                 <w:sz w:val="20"/>
               </w:rPr>
-              <w:t xml:space="preserve">Si NO es controlable: EVACUAR por lado contrario al fuego</w:t>
+              <w:t xml:space="preserve">Si NO controlable: EVACUAR por lado opuesto al fuego</w:t>
             </w:r>
           </w:p>
         </w:tc>
@@ -1065,7 +1164,7 @@
               <w:rPr>
                 <w:sz w:val="20"/>
               </w:rPr>
-              <w:t xml:space="preserve">Solicitar desconexión de catenaria al CCO</w:t>
+              <w:t xml:space="preserve">Solicitar desconexión eléctrica al CCO</w:t>
             </w:r>
           </w:p>
         </w:tc>
@@ -1143,7 +1242,7 @@
         <w:pStyle w:val="Heading3"/>
       </w:pPr>
       <w:r>
-        <w:t xml:space="preserve">COLISIÓN EN PASO A NIVEL</w:t>
+        <w:t xml:space="preserve">DESLIZAMIENTO DE TIERRA SOBRE LA VÍA</w:t>
       </w:r>
     </w:p>
     <w:p>
@@ -1195,6 +1294,21 @@
             </w:r>
           </w:p>
         </w:tc>
+        <w:tc>
+          <w:tcPr>
+            <w:shd w:val="clear" w:color="auto" w:fill="1F4E79"/>
+          </w:tcPr>
+          <w:p>
+            <w:r>
+              <w:rPr>
+                <w:b/>
+                <w:color w:val="FFFFFF"/>
+                <w:sz w:val="20"/>
+              </w:rPr>
+              <w:t xml:space="preserve">IMPORTANTE</w:t>
+            </w:r>
+          </w:p>
+        </w:tc>
       </w:tr>
       <w:tr>
         <w:tc>
@@ -1213,7 +1327,17 @@
               <w:rPr>
                 <w:sz w:val="20"/>
               </w:rPr>
-              <w:t xml:space="preserve">Aplicar freno de emergencia</w:t>
+              <w:t xml:space="preserve">Detenerse INMEDIATAMENTE</w:t>
+            </w:r>
+          </w:p>
+        </w:tc>
+        <w:tc>
+          <w:p>
+            <w:r>
+              <w:rPr>
+                <w:sz w:val="20"/>
+              </w:rPr>
+              <w:t xml:space="preserve">NO cruzar!</w:t>
             </w:r>
           </w:p>
         </w:tc>
@@ -1235,7 +1359,17 @@
               <w:rPr>
                 <w:sz w:val="20"/>
               </w:rPr>
-              <w:t xml:space="preserve">Sonar bocina continuamente antes del impacto</w:t>
+              <w:t xml:space="preserve">Evaluar riesgo de nuevo deslizamiento</w:t>
+            </w:r>
+          </w:p>
+        </w:tc>
+        <w:tc>
+          <w:p>
+            <w:r>
+              <w:rPr>
+                <w:sz w:val="20"/>
+              </w:rPr>
+              <w:t xml:space="preserve">Observar ladera</w:t>
             </w:r>
           </w:p>
         </w:tc>
@@ -1257,7 +1391,17 @@
               <w:rPr>
                 <w:sz w:val="20"/>
               </w:rPr>
-              <w:t xml:space="preserve">Protegerse (agacharse lejos de ventanas frontales)</w:t>
+              <w:t xml:space="preserve">Si hay riesgo: retroceder (con autorización CCO)</w:t>
+            </w:r>
+          </w:p>
+        </w:tc>
+        <w:tc>
+          <w:p>
+            <w:r>
+              <w:rPr>
+                <w:sz w:val="20"/>
+              </w:rPr>
+              <w:t xml:space="preserve"/>
             </w:r>
           </w:p>
         </w:tc>
@@ -1279,7 +1423,17 @@
               <w:rPr>
                 <w:sz w:val="20"/>
               </w:rPr>
-              <w:t xml:space="preserve">Post-impacto: evaluar su propia condición</w:t>
+              <w:t xml:space="preserve">Reportar al CCO: ubicación y magnitud</w:t>
+            </w:r>
+          </w:p>
+        </w:tc>
+        <w:tc>
+          <w:p>
+            <w:r>
+              <w:rPr>
+                <w:sz w:val="20"/>
+              </w:rPr>
+              <w:t xml:space="preserve"/>
             </w:r>
           </w:p>
         </w:tc>
@@ -1301,7 +1455,17 @@
               <w:rPr>
                 <w:sz w:val="20"/>
               </w:rPr>
-              <w:t xml:space="preserve">Reportar al CCO</w:t>
+              <w:t xml:space="preserve">CCO notifica a INVÍAS/ANI</w:t>
+            </w:r>
+          </w:p>
+        </w:tc>
+        <w:tc>
+          <w:p>
+            <w:r>
+              <w:rPr>
+                <w:sz w:val="20"/>
+              </w:rPr>
+              <w:t xml:space="preserve">Evaluación geotécnica</w:t>
             </w:r>
           </w:p>
         </w:tc>
@@ -1323,7 +1487,17 @@
               <w:rPr>
                 <w:sz w:val="20"/>
               </w:rPr>
-              <w:t xml:space="preserve">Verificar estado de pasajeros</w:t>
+              <w:t xml:space="preserve">Mantener pasajeros informados</w:t>
+            </w:r>
+          </w:p>
+        </w:tc>
+        <w:tc>
+          <w:p>
+            <w:r>
+              <w:rPr>
+                <w:sz w:val="20"/>
+              </w:rPr>
+              <w:t xml:space="preserve"/>
             </w:r>
           </w:p>
         </w:tc>
@@ -1345,29 +1519,17 @@
               <w:rPr>
                 <w:sz w:val="20"/>
               </w:rPr>
-              <w:t xml:space="preserve">NO descender si hay riesgo (incendio, derrame)</w:t>
-            </w:r>
-          </w:p>
-        </w:tc>
-      </w:tr>
-      <w:tr>
-        <w:tc>
-          <w:p>
-            <w:r>
-              <w:rPr>
-                <w:sz w:val="20"/>
-              </w:rPr>
-              <w:t xml:space="preserve">8</w:t>
-            </w:r>
-          </w:p>
-        </w:tc>
-        <w:tc>
-          <w:p>
-            <w:r>
-              <w:rPr>
-                <w:sz w:val="20"/>
-              </w:rPr>
-              <w:t xml:space="preserve">Asistir a víctimas SOLO si es seguro</w:t>
+              <w:t xml:space="preserve">NO descender en zona de ladera inestable</w:t>
+            </w:r>
+          </w:p>
+        </w:tc>
+        <w:tc>
+          <w:p>
+            <w:r>
+              <w:rPr>
+                <w:sz w:val="20"/>
+              </w:rPr>
+              <w:t xml:space="preserve"/>
             </w:r>
           </w:p>
         </w:tc>
@@ -1401,7 +1563,7 @@
         <w:pStyle w:val="Heading3"/>
       </w:pPr>
       <w:r>
-        <w:t xml:space="preserve">AMENAZA DE BOMBA / OBJETO SOSPECHOSO</w:t>
+        <w:t xml:space="preserve">COLISIÓN EN PASO A NIVEL</w:t>
       </w:r>
     </w:p>
     <w:p>
@@ -1453,21 +1615,6 @@
             </w:r>
           </w:p>
         </w:tc>
-        <w:tc>
-          <w:tcPr>
-            <w:shd w:val="clear" w:color="auto" w:fill="1F4E79"/>
-          </w:tcPr>
-          <w:p>
-            <w:r>
-              <w:rPr>
-                <w:b/>
-                <w:color w:val="FFFFFF"/>
-                <w:sz w:val="20"/>
-              </w:rPr>
-              <w:t xml:space="preserve">¡IMPORTANTE!</w:t>
-            </w:r>
-          </w:p>
-        </w:tc>
       </w:tr>
       <w:tr>
         <w:tc>
@@ -1486,17 +1633,7 @@
               <w:rPr>
                 <w:sz w:val="20"/>
               </w:rPr>
-              <w:t xml:space="preserve">NO TOCAR el objeto</w:t>
-            </w:r>
-          </w:p>
-        </w:tc>
-        <w:tc>
-          <w:p>
-            <w:r>
-              <w:rPr>
-                <w:sz w:val="20"/>
-              </w:rPr>
-              <w:t xml:space="preserve">Nunca</w:t>
+              <w:t xml:space="preserve">Aplicar freno de emergencia</w:t>
             </w:r>
           </w:p>
         </w:tc>
@@ -1518,17 +1655,7 @@
               <w:rPr>
                 <w:sz w:val="20"/>
               </w:rPr>
-              <w:t xml:space="preserve">NO usar radio/celular cerca del objeto</w:t>
-            </w:r>
-          </w:p>
-        </w:tc>
-        <w:tc>
-          <w:p>
-            <w:r>
-              <w:rPr>
-                <w:sz w:val="20"/>
-              </w:rPr>
-              <w:t xml:space="preserve">Puede detonar</w:t>
+              <w:t xml:space="preserve">Sonar bocina continuamente</w:t>
             </w:r>
           </w:p>
         </w:tc>
@@ -1550,17 +1677,7 @@
               <w:rPr>
                 <w:sz w:val="20"/>
               </w:rPr>
-              <w:t xml:space="preserve">Alejarse y alejar a personas</w:t>
-            </w:r>
-          </w:p>
-        </w:tc>
-        <w:tc>
-          <w:p>
-            <w:r>
-              <w:rPr>
-                <w:sz w:val="20"/>
-              </w:rPr>
-              <w:t xml:space="preserve">Mín. 300m</w:t>
+              <w:t xml:space="preserve">Protegerse del impacto</w:t>
             </w:r>
           </w:p>
         </w:tc>
@@ -1582,17 +1699,7 @@
               <w:rPr>
                 <w:sz w:val="20"/>
               </w:rPr>
-              <w:t xml:space="preserve">Notificar al CCO desde distancia segura</w:t>
-            </w:r>
-          </w:p>
-        </w:tc>
-        <w:tc>
-          <w:p>
-            <w:r>
-              <w:rPr>
-                <w:sz w:val="20"/>
-              </w:rPr>
-              <w:t xml:space="preserve"/>
+              <w:t xml:space="preserve">Post-impacto: evaluar su propia condición</w:t>
             </w:r>
           </w:p>
         </w:tc>
@@ -1614,17 +1721,7 @@
               <w:rPr>
                 <w:sz w:val="20"/>
               </w:rPr>
-              <w:t xml:space="preserve">Detener tren en zona abierta (orden CCO)</w:t>
-            </w:r>
-          </w:p>
-        </w:tc>
-        <w:tc>
-          <w:p>
-            <w:r>
-              <w:rPr>
-                <w:sz w:val="20"/>
-              </w:rPr>
-              <w:t xml:space="preserve"/>
+              <w:t xml:space="preserve">Reportar al CCO + Línea 123</w:t>
             </w:r>
           </w:p>
         </w:tc>
@@ -1646,17 +1743,7 @@
               <w:rPr>
                 <w:sz w:val="20"/>
               </w:rPr>
-              <w:t xml:space="preserve">Evacuar a pasajeros en dirección opuesta al objeto</w:t>
-            </w:r>
-          </w:p>
-        </w:tc>
-        <w:tc>
-          <w:p>
-            <w:r>
-              <w:rPr>
-                <w:sz w:val="20"/>
-              </w:rPr>
-              <w:t xml:space="preserve"/>
+              <w:t xml:space="preserve">Descender SOLO si es seguro</w:t>
             </w:r>
           </w:p>
         </w:tc>
@@ -1678,17 +1765,73 @@
               <w:rPr>
                 <w:sz w:val="20"/>
               </w:rPr>
-              <w:t xml:space="preserve">Esperar equipo antiexplosivos</w:t>
-            </w:r>
-          </w:p>
-        </w:tc>
-        <w:tc>
-          <w:p>
-            <w:r>
-              <w:rPr>
-                <w:sz w:val="20"/>
-              </w:rPr>
-              <w:t xml:space="preserve">NO regresar</w:t>
+              <w:t xml:space="preserve">Primeros auxilios si la víctima tiene signos de vida</w:t>
+            </w:r>
+          </w:p>
+        </w:tc>
+      </w:tr>
+      <w:tr>
+        <w:tc>
+          <w:p>
+            <w:r>
+              <w:rPr>
+                <w:sz w:val="20"/>
+              </w:rPr>
+              <w:t xml:space="preserve">8</w:t>
+            </w:r>
+          </w:p>
+        </w:tc>
+        <w:tc>
+          <w:p>
+            <w:r>
+              <w:rPr>
+                <w:sz w:val="20"/>
+              </w:rPr>
+              <w:t xml:space="preserve">NO mover a la víctima (posible lesión columna)</w:t>
+            </w:r>
+          </w:p>
+        </w:tc>
+      </w:tr>
+      <w:tr>
+        <w:tc>
+          <w:p>
+            <w:r>
+              <w:rPr>
+                <w:sz w:val="20"/>
+              </w:rPr>
+              <w:t xml:space="preserve">9</w:t>
+            </w:r>
+          </w:p>
+        </w:tc>
+        <w:tc>
+          <w:p>
+            <w:r>
+              <w:rPr>
+                <w:sz w:val="20"/>
+              </w:rPr>
+              <w:t xml:space="preserve">Proteger escena para Policía/CTI</w:t>
+            </w:r>
+          </w:p>
+        </w:tc>
+      </w:tr>
+      <w:tr>
+        <w:tc>
+          <w:p>
+            <w:r>
+              <w:rPr>
+                <w:sz w:val="20"/>
+              </w:rPr>
+              <w:t xml:space="preserve">10</w:t>
+            </w:r>
+          </w:p>
+        </w:tc>
+        <w:tc>
+          <w:p>
+            <w:r>
+              <w:rPr>
+                <w:sz w:val="20"/>
+              </w:rPr>
+              <w:t xml:space="preserve">Buscar apoyo emocional post-evento</w:t>
             </w:r>
           </w:p>
         </w:tc>
@@ -1722,7 +1865,7 @@
         <w:pStyle w:val="Heading3"/>
       </w:pPr>
       <w:r>
-        <w:t xml:space="preserve">DERRAME DE MATERIAL PELIGROSO (HAZMAT)</w:t>
+        <w:t xml:space="preserve">DERRAME DE MATERIAL PELIGROSO (MATPEL)</w:t>
       </w:r>
     </w:p>
     <w:p>
@@ -1785,7 +1928,7 @@
                 <w:color w:val="FFFFFF"/>
                 <w:sz w:val="20"/>
               </w:rPr>
-              <w:t xml:space="preserve">¡IMPORTANTE!</w:t>
+              <w:t xml:space="preserve">IMPORTANTE</w:t>
             </w:r>
           </w:p>
         </w:tc>
@@ -1849,7 +1992,7 @@
               <w:rPr>
                 <w:sz w:val="20"/>
               </w:rPr>
-              <w:t xml:space="preserve">Nunca</w:t>
+              <w:t xml:space="preserve">NUNCA</w:t>
             </w:r>
           </w:p>
         </w:tc>
@@ -1881,7 +2024,7 @@
               <w:rPr>
                 <w:sz w:val="20"/>
               </w:rPr>
-              <w:t xml:space="preserve">Nunca</w:t>
+              <w:t xml:space="preserve">NUNCA</w:t>
             </w:r>
           </w:p>
         </w:tc>
@@ -1935,17 +2078,17 @@
               <w:rPr>
                 <w:sz w:val="20"/>
               </w:rPr>
-              <w:t xml:space="preserve">Reportar al CCO</w:t>
-            </w:r>
-          </w:p>
-        </w:tc>
-        <w:tc>
-          <w:p>
-            <w:r>
-              <w:rPr>
-                <w:sz w:val="20"/>
-              </w:rPr>
-              <w:t xml:space="preserve">Material + cantidad + dirección viento</w:t>
+              <w:t xml:space="preserve">Reportar al CCO + 123</w:t>
+            </w:r>
+          </w:p>
+        </w:tc>
+        <w:tc>
+          <w:p>
+            <w:r>
+              <w:rPr>
+                <w:sz w:val="20"/>
+              </w:rPr>
+              <w:t xml:space="preserve">Material + cantidad + viento</w:t>
             </w:r>
           </w:p>
         </w:tc>
@@ -1967,17 +2110,17 @@
               <w:rPr>
                 <w:sz w:val="20"/>
               </w:rPr>
-              <w:t xml:space="preserve">Restringir acceso a la zona</w:t>
-            </w:r>
-          </w:p>
-        </w:tc>
-        <w:tc>
-          <w:p>
-            <w:r>
-              <w:rPr>
-                <w:sz w:val="20"/>
-              </w:rPr>
-              <w:t xml:space="preserve">Mín. 300m inicial</w:t>
+              <w:t xml:space="preserve">Alertar a comunidades cercanas</w:t>
+            </w:r>
+          </w:p>
+        </w:tc>
+        <w:tc>
+          <w:p>
+            <w:r>
+              <w:rPr>
+                <w:sz w:val="20"/>
+              </w:rPr>
+              <w:t xml:space="preserve">Si hay riesgo</w:t>
             </w:r>
           </w:p>
         </w:tc>
@@ -1999,7 +2142,7 @@
               <w:rPr>
                 <w:sz w:val="20"/>
               </w:rPr>
-              <w:t xml:space="preserve">Esperar equipo HAZMAT especializado</w:t>
+              <w:t xml:space="preserve">Restringir acceso mín. 300m</w:t>
             </w:r>
           </w:p>
         </w:tc>
@@ -2014,6 +2157,38 @@
           </w:p>
         </w:tc>
       </w:tr>
+      <w:tr>
+        <w:tc>
+          <w:p>
+            <w:r>
+              <w:rPr>
+                <w:sz w:val="20"/>
+              </w:rPr>
+              <w:t xml:space="preserve">8</w:t>
+            </w:r>
+          </w:p>
+        </w:tc>
+        <w:tc>
+          <w:p>
+            <w:r>
+              <w:rPr>
+                <w:sz w:val="20"/>
+              </w:rPr>
+              <w:t xml:space="preserve">Esperar equipo MATPEL (Bomberos especializados)</w:t>
+            </w:r>
+          </w:p>
+        </w:tc>
+        <w:tc>
+          <w:p>
+            <w:r>
+              <w:rPr>
+                <w:sz w:val="20"/>
+              </w:rPr>
+              <w:t xml:space="preserve"/>
+            </w:r>
+          </w:p>
+        </w:tc>
+      </w:tr>
     </w:tbl>
     <w:p>
       <w:r>
@@ -2027,7 +2202,7 @@
     </w:p>
     <w:p>
       <w:r>
-        <w:t xml:space="preserve">Distancias mínimas de aislamiento:</w:t>
+        <w:t xml:space="preserve">Distancias mínimas:</w:t>
       </w:r>
     </w:p>
     <w:p>
@@ -2068,7 +2243,7 @@
         <w:pStyle w:val="Heading3"/>
       </w:pPr>
       <w:r>
-        <w:t xml:space="preserve">ELECTROCUCIÓN / CATENARIA DAÑADA</w:t>
+        <w:t xml:space="preserve">AMENAZA DE BOMBA / ORDEN PÚBLICO</w:t>
       </w:r>
     </w:p>
     <w:p>
@@ -2131,7 +2306,7 @@
                 <w:color w:val="FFFFFF"/>
                 <w:sz w:val="20"/>
               </w:rPr>
-              <w:t xml:space="preserve">¡PELIGRO MORTAL!</w:t>
+              <w:t xml:space="preserve">IMPORTANTE</w:t>
             </w:r>
           </w:p>
         </w:tc>
@@ -2153,17 +2328,17 @@
               <w:rPr>
                 <w:sz w:val="20"/>
               </w:rPr>
-              <w:t xml:space="preserve">NO TOCAR cables caídos ni a la víctima si está en contacto</w:t>
-            </w:r>
-          </w:p>
-        </w:tc>
-        <w:tc>
-          <w:p>
-            <w:r>
-              <w:rPr>
-                <w:sz w:val="20"/>
-              </w:rPr>
-              <w:t xml:space="preserve">25,000V</w:t>
+              <w:t xml:space="preserve">NO TOCAR el objeto sospechoso</w:t>
+            </w:r>
+          </w:p>
+        </w:tc>
+        <w:tc>
+          <w:p>
+            <w:r>
+              <w:rPr>
+                <w:sz w:val="20"/>
+              </w:rPr>
+              <w:t xml:space="preserve">Nunca</w:t>
             </w:r>
           </w:p>
         </w:tc>
@@ -2185,17 +2360,17 @@
               <w:rPr>
                 <w:sz w:val="20"/>
               </w:rPr>
-              <w:t xml:space="preserve">Alejarse mínimo 3 metros de cables</w:t>
-            </w:r>
-          </w:p>
-        </w:tc>
-        <w:tc>
-          <w:p>
-            <w:r>
-              <w:rPr>
-                <w:sz w:val="20"/>
-              </w:rPr>
-              <w:t xml:space="preserve">Tensión de paso</w:t>
+              <w:t xml:space="preserve">NO usar radio/celular cerca</w:t>
+            </w:r>
+          </w:p>
+        </w:tc>
+        <w:tc>
+          <w:p>
+            <w:r>
+              <w:rPr>
+                <w:sz w:val="20"/>
+              </w:rPr>
+              <w:t xml:space="preserve">Puede detonar</w:t>
             </w:r>
           </w:p>
         </w:tc>
@@ -2217,7 +2392,7 @@
               <w:rPr>
                 <w:sz w:val="20"/>
               </w:rPr>
-              <w:t xml:space="preserve">Notificar al CCO: URGENTE desconexión de catenaria</w:t>
+              <w:t xml:space="preserve">Alejarse mín. 300m</w:t>
             </w:r>
           </w:p>
         </w:tc>
@@ -2249,7 +2424,7 @@
               <w:rPr>
                 <w:sz w:val="20"/>
               </w:rPr>
-              <w:t xml:space="preserve">NO permitir que nadie descienda del tren</w:t>
+              <w:t xml:space="preserve">Reportar al CCO desde distancia segura</w:t>
             </w:r>
           </w:p>
         </w:tc>
@@ -2281,7 +2456,7 @@
               <w:rPr>
                 <w:sz w:val="20"/>
               </w:rPr>
-              <w:t xml:space="preserve">Esperar confirmación de DESENERGIZACIÓN</w:t>
+              <w:t xml:space="preserve">CCO llama a 123 → Policía Nacional (Antiexplosivos)</w:t>
             </w:r>
           </w:p>
         </w:tc>
@@ -2313,7 +2488,39 @@
               <w:rPr>
                 <w:sz w:val="20"/>
               </w:rPr>
-              <w:t xml:space="preserve">Solo entonces iniciar primeros auxilios a la víctima</w:t>
+              <w:t xml:space="preserve">Evacuar pasajeros en dirección opuesta</w:t>
+            </w:r>
+          </w:p>
+        </w:tc>
+        <w:tc>
+          <w:p>
+            <w:r>
+              <w:rPr>
+                <w:sz w:val="20"/>
+              </w:rPr>
+              <w:t xml:space="preserve"/>
+            </w:r>
+          </w:p>
+        </w:tc>
+      </w:tr>
+      <w:tr>
+        <w:tc>
+          <w:p>
+            <w:r>
+              <w:rPr>
+                <w:sz w:val="20"/>
+              </w:rPr>
+              <w:t xml:space="preserve">7</w:t>
+            </w:r>
+          </w:p>
+        </w:tc>
+        <w:tc>
+          <w:p>
+            <w:r>
+              <w:rPr>
+                <w:sz w:val="20"/>
+              </w:rPr>
+              <w:t xml:space="preserve">NO regresar hasta orden de autoridad</w:t>
             </w:r>
           </w:p>
         </w:tc>
@@ -2357,7 +2564,7 @@
         <w:pStyle w:val="Heading3"/>
       </w:pPr>
       <w:r>
-        <w:t xml:space="preserve">ARROLLAMIENTO DE PERSONA</w:t>
+        <w:t xml:space="preserve">ELECTROCUCIÓN / SISTEMA ELÉCTRICO</w:t>
       </w:r>
     </w:p>
     <w:p>
@@ -2409,6 +2616,21 @@
             </w:r>
           </w:p>
         </w:tc>
+        <w:tc>
+          <w:tcPr>
+            <w:shd w:val="clear" w:color="auto" w:fill="1F4E79"/>
+          </w:tcPr>
+          <w:p>
+            <w:r>
+              <w:rPr>
+                <w:b/>
+                <w:color w:val="FFFFFF"/>
+                <w:sz w:val="20"/>
+              </w:rPr>
+              <w:t xml:space="preserve">PELIGRO MORTAL</w:t>
+            </w:r>
+          </w:p>
+        </w:tc>
       </w:tr>
       <w:tr>
         <w:tc>
@@ -2427,7 +2649,17 @@
               <w:rPr>
                 <w:sz w:val="20"/>
               </w:rPr>
-              <w:t xml:space="preserve">Aplicar freno de emergencia</w:t>
+              <w:t xml:space="preserve">NO TOCAR cables caídos ni a la víctima en contacto</w:t>
+            </w:r>
+          </w:p>
+        </w:tc>
+        <w:tc>
+          <w:p>
+            <w:r>
+              <w:rPr>
+                <w:sz w:val="20"/>
+              </w:rPr>
+              <w:t xml:space="preserve">1,500V DC (Metro) / 25,000V AC</w:t>
             </w:r>
           </w:p>
         </w:tc>
@@ -2449,7 +2681,17 @@
               <w:rPr>
                 <w:sz w:val="20"/>
               </w:rPr>
-              <w:t xml:space="preserve">Reportar al CCO (km exacto)</w:t>
+              <w:t xml:space="preserve">Alejarse mínimo 3 metros</w:t>
+            </w:r>
+          </w:p>
+        </w:tc>
+        <w:tc>
+          <w:p>
+            <w:r>
+              <w:rPr>
+                <w:sz w:val="20"/>
+              </w:rPr>
+              <w:t xml:space="preserve">Tensión de paso</w:t>
             </w:r>
           </w:p>
         </w:tc>
@@ -2471,7 +2713,17 @@
               <w:rPr>
                 <w:sz w:val="20"/>
               </w:rPr>
-              <w:t xml:space="preserve">Descender SOLO si es seguro (verificar vía adyacente)</w:t>
+              <w:t xml:space="preserve">Reportar al CCO: URGENTE desconexión</w:t>
+            </w:r>
+          </w:p>
+        </w:tc>
+        <w:tc>
+          <w:p>
+            <w:r>
+              <w:rPr>
+                <w:sz w:val="20"/>
+              </w:rPr>
+              <w:t xml:space="preserve"/>
             </w:r>
           </w:p>
         </w:tc>
@@ -2493,7 +2745,17 @@
               <w:rPr>
                 <w:sz w:val="20"/>
               </w:rPr>
-              <w:t xml:space="preserve">Evaluar estado de la víctima</w:t>
+              <w:t xml:space="preserve">NO permitir descenso de pasajeros</w:t>
+            </w:r>
+          </w:p>
+        </w:tc>
+        <w:tc>
+          <w:p>
+            <w:r>
+              <w:rPr>
+                <w:sz w:val="20"/>
+              </w:rPr>
+              <w:t xml:space="preserve"/>
             </w:r>
           </w:p>
         </w:tc>
@@ -2515,7 +2777,17 @@
               <w:rPr>
                 <w:sz w:val="20"/>
               </w:rPr>
-              <w:t xml:space="preserve">Si hay signos de vida: primeros auxilios básicos</w:t>
+              <w:t xml:space="preserve">Esperar confirmación de DESENERGIZACIÓN</w:t>
+            </w:r>
+          </w:p>
+        </w:tc>
+        <w:tc>
+          <w:p>
+            <w:r>
+              <w:rPr>
+                <w:sz w:val="20"/>
+              </w:rPr>
+              <w:t xml:space="preserve"/>
             </w:r>
           </w:p>
         </w:tc>
@@ -2537,51 +2809,17 @@
               <w:rPr>
                 <w:sz w:val="20"/>
               </w:rPr>
-              <w:t xml:space="preserve">NO mover a la víctima (posible lesión de columna)</w:t>
-            </w:r>
-          </w:p>
-        </w:tc>
-      </w:tr>
-      <w:tr>
-        <w:tc>
-          <w:p>
-            <w:r>
-              <w:rPr>
-                <w:sz w:val="20"/>
-              </w:rPr>
-              <w:t xml:space="preserve">7</w:t>
-            </w:r>
-          </w:p>
-        </w:tc>
-        <w:tc>
-          <w:p>
-            <w:r>
-              <w:rPr>
-                <w:sz w:val="20"/>
-              </w:rPr>
-              <w:t xml:space="preserve">Proteger la escena para investigación</w:t>
-            </w:r>
-          </w:p>
-        </w:tc>
-      </w:tr>
-      <w:tr>
-        <w:tc>
-          <w:p>
-            <w:r>
-              <w:rPr>
-                <w:sz w:val="20"/>
-              </w:rPr>
-              <w:t xml:space="preserve">8</w:t>
-            </w:r>
-          </w:p>
-        </w:tc>
-        <w:tc>
-          <w:p>
-            <w:r>
-              <w:rPr>
-                <w:sz w:val="20"/>
-              </w:rPr>
-              <w:t xml:space="preserve">Esperar servicios de emergencia</w:t>
+              <w:t xml:space="preserve">Solo entonces atender a la víctima</w:t>
+            </w:r>
+          </w:p>
+        </w:tc>
+        <w:tc>
+          <w:p>
+            <w:r>
+              <w:rPr>
+                <w:sz w:val="20"/>
+              </w:rPr>
+              <w:t xml:space="preserve"/>
             </w:r>
           </w:p>
         </w:tc>
@@ -2603,11 +2841,6 @@
           <w:color w:val="CCCCCC"/>
         </w:rPr>
         <w:t xml:space="preserve">────────────────────────────────────────────────────────────</w:t>
-      </w:r>
-    </w:p>
-    <w:p>
-      <w:r>
-        <w:t xml:space="preserve"/>
       </w:r>
     </w:p>
     <w:p>
@@ -2635,23 +2868,21 @@
           <w:sz w:val="18"/>
         </w:rPr>
         <w:t xml:space="preserve">¿HAY PELIGRO INMINENTE?
-(incendio incontrolable, explosión, inundación, gas tóxico)
+(incendio, explosión, inundación, gas tóxico, ladera inestable)
           │
     ┌─────┴─────┐
     │ SÍ        │ NO
     │           │
     ▼           ▼
  EVACUAR     ¿Está en zona segura?
- AHORA       (no túnel, no puente,
+ AHORA       (no túnel, no puente, no ladera,
              no catenaria dañada)
                   │
             ┌─────┴─────┐
             │ SÍ        │ NO
-            │           │
             ▼           ▼
-      Esperar        Contactar CCO
-      instrucciones  para evaluar
-      del CCO        opciones</w:t>
+      Esperar       Contactar CCO
+      instrucciones  para evaluar</w:t>
       </w:r>
     </w:p>
     <w:p>
@@ -2664,39 +2895,6 @@
         <w:pStyle w:val="Heading3"/>
       </w:pPr>
       <w:r>
-        <w:t xml:space="preserve">Lado seguro de evacuación:</w:t>
-      </w:r>
-    </w:p>
-    <w:p>
-      <w:r>
-        <w:t xml:space="preserve">  • Lado OPUESTO a vía adyacente con tráfico</w:t>
-      </w:r>
-    </w:p>
-    <w:p>
-      <w:r>
-        <w:t xml:space="preserve">  • Lado OPUESTO al fuego/derrame</w:t>
-      </w:r>
-    </w:p>
-    <w:p>
-      <w:r>
-        <w:t xml:space="preserve">  • Confirmar con CCO antes de abrir puertas</w:t>
-      </w:r>
-    </w:p>
-    <w:p>
-      <w:r>
-        <w:t xml:space="preserve">  • Verificar que catenaria esté desenergizada</w:t>
-      </w:r>
-    </w:p>
-    <w:p>
-      <w:r>
-        <w:t xml:space="preserve"/>
-      </w:r>
-    </w:p>
-    <w:p>
-      <w:pPr>
-        <w:pStyle w:val="Heading3"/>
-      </w:pPr>
-      <w:r>
         <w:t xml:space="preserve">Prioridad de evacuación:</w:t>
       </w:r>
     </w:p>
@@ -2707,7 +2905,12 @@
     </w:p>
     <w:p>
       <w:r>
-        <w:t xml:space="preserve">  Niños y ancianos</w:t>
+        <w:t xml:space="preserve">  Niños y adultos mayores</w:t>
+      </w:r>
+    </w:p>
+    <w:p>
+      <w:r>
+        <w:t xml:space="preserve">  Mujeres embarazadas</w:t>
       </w:r>
     </w:p>
     <w:p>
@@ -2838,7 +3041,7 @@
               <w:rPr>
                 <w:sz w:val="20"/>
               </w:rPr>
-              <w:t xml:space="preserve">Fallecido - No tratar</w:t>
+              <w:t xml:space="preserve">Fallecido</w:t>
             </w:r>
           </w:p>
         </w:tc>
@@ -2860,17 +3063,17 @@
               <w:rPr>
                 <w:sz w:val="20"/>
               </w:rPr>
-              <w:t xml:space="preserve">Respira pero: FR&gt;30, no pulso radial, no obedece órdenes</w:t>
-            </w:r>
-          </w:p>
-        </w:tc>
-        <w:tc>
-          <w:p>
-            <w:r>
-              <w:rPr>
-                <w:sz w:val="20"/>
-              </w:rPr>
-              <w:t xml:space="preserve">Inmediato - Prioridad 1</w:t>
+              <w:t xml:space="preserve">No camina + FR&gt;30 o sin pulso radial o inconsciente</w:t>
+            </w:r>
+          </w:p>
+        </w:tc>
+        <w:tc>
+          <w:p>
+            <w:r>
+              <w:rPr>
+                <w:sz w:val="20"/>
+              </w:rPr>
+              <w:t xml:space="preserve">Inmediato</w:t>
             </w:r>
           </w:p>
         </w:tc>
@@ -2892,17 +3095,17 @@
               <w:rPr>
                 <w:sz w:val="20"/>
               </w:rPr>
-              <w:t xml:space="preserve">Respira, pulso presente, obedece órdenes, NO camina</w:t>
-            </w:r>
-          </w:p>
-        </w:tc>
-        <w:tc>
-          <w:p>
-            <w:r>
-              <w:rPr>
-                <w:sz w:val="20"/>
-              </w:rPr>
-              <w:t xml:space="preserve">Urgente - Prioridad 2</w:t>
+              <w:t xml:space="preserve">No camina + respira + pulso + consciente</w:t>
+            </w:r>
+          </w:p>
+        </w:tc>
+        <w:tc>
+          <w:p>
+            <w:r>
+              <w:rPr>
+                <w:sz w:val="20"/>
+              </w:rPr>
+              <w:t xml:space="preserve">Urgente</w:t>
             </w:r>
           </w:p>
         </w:tc>
@@ -2934,7 +3137,7 @@
               <w:rPr>
                 <w:sz w:val="20"/>
               </w:rPr>
-              <w:t xml:space="preserve">Menor - Prioridad 3</w:t>
+              <w:t xml:space="preserve">Menor</w:t>
             </w:r>
           </w:p>
         </w:tc>
@@ -2952,7 +3155,7 @@
     </w:p>
     <w:p>
       <w:r>
-        <w:t xml:space="preserve">Regla rápida: Si la persona CAMINA → VERDE. Si NO camina → evaluar respiración → evaluar circulación → evaluar estado mental.</w:t>
+        <w:t xml:space="preserve">Regla: Si CAMINA → VERDE. Si NO camina → evaluar respiración → circulación → conciencia.</w:t>
       </w:r>
     </w:p>
     <w:p>
@@ -2978,7 +3181,144 @@
         <w:pStyle w:val="Heading2"/>
       </w:pPr>
       <w:r>
-        <w:t xml:space="preserve">SEÑALES DE EMERGENCIA</w:t>
+        <w:t xml:space="preserve">COORDINACIÓN INSTITUCIONAL COLOMBIA</w:t>
+      </w:r>
+    </w:p>
+    <w:p>
+      <w:r>
+        <w:t xml:space="preserve"/>
+      </w:r>
+    </w:p>
+    <w:p>
+      <w:r>
+        <w:rPr>
+          <w:color w:val="333333"/>
+          <w:sz w:val="18"/>
+        </w:rPr>
+        <w:t xml:space="preserve">YO (primer respondedor)
+    │
+    ├──→ CCO del operador
+    │
+    ├──→ Línea 123 (despacha todo)
+    │         │
+    │         ├── Bomberos (119)
+    │         ├── Ambulancia (CRUE)
+    │         ├── Policía (112)
+    │         └── Defensa Civil (144)
+    │
+    └──→ Mi supervisor directo</w:t>
+      </w:r>
+    </w:p>
+    <w:p>
+      <w:r>
+        <w:t xml:space="preserve"/>
+      </w:r>
+    </w:p>
+    <w:p>
+      <w:r>
+        <w:rPr>
+          <w:color w:val="CCCCCC"/>
+        </w:rPr>
+        <w:t xml:space="preserve">────────────────────────────────────────────────────────────</w:t>
+      </w:r>
+    </w:p>
+    <w:p>
+      <w:r>
+        <w:t xml:space="preserve"/>
+      </w:r>
+    </w:p>
+    <w:p>
+      <w:pPr>
+        <w:pStyle w:val="Heading2"/>
+      </w:pPr>
+      <w:r>
+        <w:t xml:space="preserve">CHECKLIST POST-EMERGENCIA</w:t>
+      </w:r>
+    </w:p>
+    <w:p>
+      <w:r>
+        <w:t xml:space="preserve"/>
+      </w:r>
+    </w:p>
+    <w:p>
+      <w:r>
+        <w:t xml:space="preserve">  • [ ] Todas las personas contabilizadas</w:t>
+      </w:r>
+    </w:p>
+    <w:p>
+      <w:r>
+        <w:t xml:space="preserve">  • [ ] Zona asegurada y señalizada</w:t>
+      </w:r>
+    </w:p>
+    <w:p>
+      <w:r>
+        <w:t xml:space="preserve">  • [ ] CCO informado del estado actual</w:t>
+      </w:r>
+    </w:p>
+    <w:p>
+      <w:r>
+        <w:t xml:space="preserve">  • [ ] Organismos de socorro en sitio</w:t>
+      </w:r>
+    </w:p>
+    <w:p>
+      <w:r>
+        <w:t xml:space="preserve">  • [ ] Heridos evacuados a hospital (CRUE coordinó)</w:t>
+      </w:r>
+    </w:p>
+    <w:p>
+      <w:r>
+        <w:t xml:space="preserve">  • [ ] Evidencia preservada (Policía/CTI/Supertransporte)</w:t>
+      </w:r>
+    </w:p>
+    <w:p>
+      <w:r>
+        <w:t xml:space="preserve">  • [ ] Informe inicial redactado</w:t>
+      </w:r>
+    </w:p>
+    <w:p>
+      <w:r>
+        <w:t xml:space="preserve">  • [ ] Bienestar del personal propio verificado</w:t>
+      </w:r>
+    </w:p>
+    <w:p>
+      <w:r>
+        <w:t xml:space="preserve">  • [ ] Supertransporte/ANI notificados</w:t>
+      </w:r>
+    </w:p>
+    <w:p>
+      <w:r>
+        <w:t xml:space="preserve">  • [ ] ARL notificada (si hay personal propio afectado)</w:t>
+      </w:r>
+    </w:p>
+    <w:p>
+      <w:r>
+        <w:t xml:space="preserve">  • [ ] Comunidades cercanas informadas</w:t>
+      </w:r>
+    </w:p>
+    <w:p>
+      <w:r>
+        <w:t xml:space="preserve"/>
+      </w:r>
+    </w:p>
+    <w:p>
+      <w:r>
+        <w:rPr>
+          <w:color w:val="CCCCCC"/>
+        </w:rPr>
+        <w:t xml:space="preserve">────────────────────────────────────────────────────────────</w:t>
+      </w:r>
+    </w:p>
+    <w:p>
+      <w:r>
+        <w:t xml:space="preserve"/>
+      </w:r>
+    </w:p>
+    <w:p>
+      <w:pPr>
+        <w:pStyle w:val="Heading2"/>
+      </w:pPr>
+      <w:r>
+        <w:t xml:space="preserve">MIS DATOS PERSONALES</w:t>
       </w:r>
     </w:p>
     <w:p>
@@ -3011,7 +3351,7 @@
                 <w:color w:val="FFFFFF"/>
                 <w:sz w:val="20"/>
               </w:rPr>
-              <w:t xml:space="preserve">Señal</w:t>
+              <w:t xml:space="preserve">Dato</w:t>
             </w:r>
           </w:p>
         </w:tc>
@@ -3026,117 +3366,227 @@
                 <w:color w:val="FFFFFF"/>
                 <w:sz w:val="20"/>
               </w:rPr>
-              <w:t xml:space="preserve">Significado</w:t>
-            </w:r>
-          </w:p>
-        </w:tc>
-      </w:tr>
-      <w:tr>
-        <w:tc>
-          <w:p>
-            <w:r>
-              <w:rPr>
-                <w:sz w:val="20"/>
-              </w:rPr>
-              <w:t xml:space="preserve">Bocina: 1 toque largo continuo</w:t>
-            </w:r>
-          </w:p>
-        </w:tc>
-        <w:tc>
-          <w:p>
-            <w:r>
-              <w:rPr>
-                <w:sz w:val="20"/>
-              </w:rPr>
-              <w:t xml:space="preserve">Emergencia / Peligro</w:t>
-            </w:r>
-          </w:p>
-        </w:tc>
-      </w:tr>
-      <w:tr>
-        <w:tc>
-          <w:p>
-            <w:r>
-              <w:rPr>
-                <w:sz w:val="20"/>
-              </w:rPr>
-              <w:t xml:space="preserve">Bocina: 3 toques cortos</w:t>
-            </w:r>
-          </w:p>
-        </w:tc>
-        <w:tc>
-          <w:p>
-            <w:r>
-              <w:rPr>
-                <w:sz w:val="20"/>
-              </w:rPr>
-              <w:t xml:space="preserve">Retroceso</w:t>
-            </w:r>
-          </w:p>
-        </w:tc>
-      </w:tr>
-      <w:tr>
-        <w:tc>
-          <w:p>
-            <w:r>
-              <w:rPr>
-                <w:sz w:val="20"/>
-              </w:rPr>
-              <w:t xml:space="preserve">Bandera roja / luz roja</w:t>
-            </w:r>
-          </w:p>
-        </w:tc>
-        <w:tc>
-          <w:p>
-            <w:r>
-              <w:rPr>
-                <w:sz w:val="20"/>
-              </w:rPr>
-              <w:t xml:space="preserve">ALTO - Peligro adelante</w:t>
-            </w:r>
-          </w:p>
-        </w:tc>
-      </w:tr>
-      <w:tr>
-        <w:tc>
-          <w:p>
-            <w:r>
-              <w:rPr>
-                <w:sz w:val="20"/>
-              </w:rPr>
-              <w:t xml:space="preserve">Movimiento circular de brazo/linterna</w:t>
-            </w:r>
-          </w:p>
-        </w:tc>
-        <w:tc>
-          <w:p>
-            <w:r>
-              <w:rPr>
-                <w:sz w:val="20"/>
-              </w:rPr>
-              <w:t xml:space="preserve">Pare inmediatamente</w:t>
-            </w:r>
-          </w:p>
-        </w:tc>
-      </w:tr>
-      <w:tr>
-        <w:tc>
-          <w:p>
-            <w:r>
-              <w:rPr>
-                <w:sz w:val="20"/>
-              </w:rPr>
-              <w:t xml:space="preserve">Brazos cruzados sobre cabeza</w:t>
-            </w:r>
-          </w:p>
-        </w:tc>
-        <w:tc>
-          <w:p>
-            <w:r>
-              <w:rPr>
-                <w:sz w:val="20"/>
-              </w:rPr>
-              <w:t xml:space="preserve">Todo bien / Sin novedad</w:t>
+              <w:t xml:space="preserve">Información</w:t>
+            </w:r>
+          </w:p>
+        </w:tc>
+      </w:tr>
+      <w:tr>
+        <w:tc>
+          <w:p>
+            <w:r>
+              <w:rPr>
+                <w:sz w:val="20"/>
+              </w:rPr>
+              <w:t xml:space="preserve">Mi identificación operativa</w:t>
+            </w:r>
+          </w:p>
+        </w:tc>
+        <w:tc>
+          <w:p>
+            <w:r>
+              <w:rPr>
+                <w:sz w:val="20"/>
+              </w:rPr>
+              <w:t xml:space="preserve">_________________</w:t>
+            </w:r>
+          </w:p>
+        </w:tc>
+      </w:tr>
+      <w:tr>
+        <w:tc>
+          <w:p>
+            <w:r>
+              <w:rPr>
+                <w:sz w:val="20"/>
+              </w:rPr>
+              <w:t xml:space="preserve">Mi base/estación</w:t>
+            </w:r>
+          </w:p>
+        </w:tc>
+        <w:tc>
+          <w:p>
+            <w:r>
+              <w:rPr>
+                <w:sz w:val="20"/>
+              </w:rPr>
+              <w:t xml:space="preserve">_________________</w:t>
+            </w:r>
+          </w:p>
+        </w:tc>
+      </w:tr>
+      <w:tr>
+        <w:tc>
+          <w:p>
+            <w:r>
+              <w:rPr>
+                <w:sz w:val="20"/>
+              </w:rPr>
+              <w:t xml:space="preserve">Mi supervisor directo</w:t>
+            </w:r>
+          </w:p>
+        </w:tc>
+        <w:tc>
+          <w:p>
+            <w:r>
+              <w:rPr>
+                <w:sz w:val="20"/>
+              </w:rPr>
+              <w:t xml:space="preserve">_________________</w:t>
+            </w:r>
+          </w:p>
+        </w:tc>
+      </w:tr>
+      <w:tr>
+        <w:tc>
+          <w:p>
+            <w:r>
+              <w:rPr>
+                <w:sz w:val="20"/>
+              </w:rPr>
+              <w:t xml:space="preserve">Corredor asignado</w:t>
+            </w:r>
+          </w:p>
+        </w:tc>
+        <w:tc>
+          <w:p>
+            <w:r>
+              <w:rPr>
+                <w:sz w:val="20"/>
+              </w:rPr>
+              <w:t xml:space="preserve">_________________</w:t>
+            </w:r>
+          </w:p>
+        </w:tc>
+      </w:tr>
+      <w:tr>
+        <w:tc>
+          <w:p>
+            <w:r>
+              <w:rPr>
+                <w:sz w:val="20"/>
+              </w:rPr>
+              <w:t xml:space="preserve">Frecuencia radio principal</w:t>
+            </w:r>
+          </w:p>
+        </w:tc>
+        <w:tc>
+          <w:p>
+            <w:r>
+              <w:rPr>
+                <w:sz w:val="20"/>
+              </w:rPr>
+              <w:t xml:space="preserve">_________________</w:t>
+            </w:r>
+          </w:p>
+        </w:tc>
+      </w:tr>
+      <w:tr>
+        <w:tc>
+          <w:p>
+            <w:r>
+              <w:rPr>
+                <w:sz w:val="20"/>
+              </w:rPr>
+              <w:t xml:space="preserve">Frecuencia radio emergencia</w:t>
+            </w:r>
+          </w:p>
+        </w:tc>
+        <w:tc>
+          <w:p>
+            <w:r>
+              <w:rPr>
+                <w:sz w:val="20"/>
+              </w:rPr>
+              <w:t xml:space="preserve">_________________</w:t>
+            </w:r>
+          </w:p>
+        </w:tc>
+      </w:tr>
+      <w:tr>
+        <w:tc>
+          <w:p>
+            <w:r>
+              <w:rPr>
+                <w:sz w:val="20"/>
+              </w:rPr>
+              <w:t xml:space="preserve">ARL a la que estoy afiliado</w:t>
+            </w:r>
+          </w:p>
+        </w:tc>
+        <w:tc>
+          <w:p>
+            <w:r>
+              <w:rPr>
+                <w:sz w:val="20"/>
+              </w:rPr>
+              <w:t xml:space="preserve">_________________</w:t>
+            </w:r>
+          </w:p>
+        </w:tc>
+      </w:tr>
+      <w:tr>
+        <w:tc>
+          <w:p>
+            <w:r>
+              <w:rPr>
+                <w:sz w:val="20"/>
+              </w:rPr>
+              <w:t xml:space="preserve">EPS a la que estoy afiliado</w:t>
+            </w:r>
+          </w:p>
+        </w:tc>
+        <w:tc>
+          <w:p>
+            <w:r>
+              <w:rPr>
+                <w:sz w:val="20"/>
+              </w:rPr>
+              <w:t xml:space="preserve">_________________</w:t>
+            </w:r>
+          </w:p>
+        </w:tc>
+      </w:tr>
+      <w:tr>
+        <w:tc>
+          <w:p>
+            <w:r>
+              <w:rPr>
+                <w:sz w:val="20"/>
+              </w:rPr>
+              <w:t xml:space="preserve">Mi tipo de sangre (RH)</w:t>
+            </w:r>
+          </w:p>
+        </w:tc>
+        <w:tc>
+          <w:p>
+            <w:r>
+              <w:rPr>
+                <w:sz w:val="20"/>
+              </w:rPr>
+              <w:t xml:space="preserve">_________________</w:t>
+            </w:r>
+          </w:p>
+        </w:tc>
+      </w:tr>
+      <w:tr>
+        <w:tc>
+          <w:p>
+            <w:r>
+              <w:rPr>
+                <w:sz w:val="20"/>
+              </w:rPr>
+              <w:t xml:space="preserve">Contacto de emergencia personal</w:t>
+            </w:r>
+          </w:p>
+        </w:tc>
+        <w:tc>
+          <w:p>
+            <w:r>
+              <w:rPr>
+                <w:sz w:val="20"/>
+              </w:rPr>
+              <w:t xml:space="preserve">_________________</w:t>
             </w:r>
           </w:p>
         </w:tc>
@@ -3166,298 +3616,8 @@
       </w:r>
     </w:p>
     <w:p>
-      <w:pPr>
-        <w:pStyle w:val="Heading2"/>
-      </w:pPr>
-      <w:r>
-        <w:t xml:space="preserve">VERIFICACIONES POST-EMERGENCIA (CHECKLIST)</w:t>
-      </w:r>
-    </w:p>
-    <w:p>
-      <w:r>
-        <w:t xml:space="preserve"/>
-      </w:r>
-    </w:p>
-    <w:p>
-      <w:r>
-        <w:t xml:space="preserve">  • [ ] Todas las personas han sido contabilizadas</w:t>
-      </w:r>
-    </w:p>
-    <w:p>
-      <w:r>
-        <w:t xml:space="preserve">  • [ ] Zona asegurada y señalizada</w:t>
-      </w:r>
-    </w:p>
-    <w:p>
-      <w:r>
-        <w:t xml:space="preserve">  • [ ] CCO informado del estado actual</w:t>
-      </w:r>
-    </w:p>
-    <w:p>
-      <w:r>
-        <w:t xml:space="preserve">  • [ ] Servicios de emergencia en sitio o en camino</w:t>
-      </w:r>
-    </w:p>
-    <w:p>
-      <w:r>
-        <w:t xml:space="preserve">  • [ ] Heridos atendidos/evacuados a hospital</w:t>
-      </w:r>
-    </w:p>
-    <w:p>
-      <w:r>
-        <w:t xml:space="preserve">  • [ ] Evidencia preservada (no mover nada innecesariamente)</w:t>
-      </w:r>
-    </w:p>
-    <w:p>
-      <w:r>
-        <w:t xml:space="preserve">  • [ ] Informe inicial redactado</w:t>
-      </w:r>
-    </w:p>
-    <w:p>
-      <w:r>
-        <w:t xml:space="preserve">  • [ ] Bienestar del personal propio verificado</w:t>
-      </w:r>
-    </w:p>
-    <w:p>
-      <w:r>
-        <w:t xml:space="preserve">  • [ ] Autoridades notificadas según protocolo</w:t>
-      </w:r>
-    </w:p>
-    <w:p>
-      <w:r>
-        <w:t xml:space="preserve"/>
-      </w:r>
-    </w:p>
-    <w:p>
-      <w:r>
-        <w:rPr>
-          <w:color w:val="CCCCCC"/>
-        </w:rPr>
-        <w:t xml:space="preserve">────────────────────────────────────────────────────────────</w:t>
-      </w:r>
-    </w:p>
-    <w:p>
-      <w:r>
-        <w:t xml:space="preserve"/>
-      </w:r>
-    </w:p>
-    <w:p>
-      <w:pPr>
-        <w:pStyle w:val="Heading2"/>
-      </w:pPr>
-      <w:r>
-        <w:t xml:space="preserve">CONTACTOS Y ANOTACIONES PERSONALES</w:t>
-      </w:r>
-    </w:p>
-    <w:p>
-      <w:r>
-        <w:t xml:space="preserve"/>
-      </w:r>
-    </w:p>
-    <w:tbl>
-      <w:tblPr>
-        <w:tblStyle w:val="TableGrid"/>
-        <w:tblW w:w="9000" w:type="dxa"/>
-        <w:tblBorders>
-          <w:top w:val="single" w:sz="4" w:space="0" w:color="auto"/>
-          <w:left w:val="single" w:sz="4" w:space="0" w:color="auto"/>
-          <w:bottom w:val="single" w:sz="4" w:space="0" w:color="auto"/>
-          <w:right w:val="single" w:sz="4" w:space="0" w:color="auto"/>
-          <w:insideH w:val="single" w:sz="4" w:space="0" w:color="auto"/>
-          <w:insideV w:val="single" w:sz="4" w:space="0" w:color="auto"/>
-        </w:tblBorders>
-      </w:tblPr>
-      <w:tr>
-        <w:tc>
-          <w:tcPr>
-            <w:shd w:val="clear" w:color="auto" w:fill="1F4E79"/>
-          </w:tcPr>
-          <w:p>
-            <w:r>
-              <w:rPr>
-                <w:b/>
-                <w:color w:val="FFFFFF"/>
-                <w:sz w:val="20"/>
-              </w:rPr>
-              <w:t xml:space="preserve">Dato</w:t>
-            </w:r>
-          </w:p>
-        </w:tc>
-        <w:tc>
-          <w:tcPr>
-            <w:shd w:val="clear" w:color="auto" w:fill="1F4E79"/>
-          </w:tcPr>
-          <w:p>
-            <w:r>
-              <w:rPr>
-                <w:b/>
-                <w:color w:val="FFFFFF"/>
-                <w:sz w:val="20"/>
-              </w:rPr>
-              <w:t xml:space="preserve">Información</w:t>
-            </w:r>
-          </w:p>
-        </w:tc>
-      </w:tr>
-      <w:tr>
-        <w:tc>
-          <w:p>
-            <w:r>
-              <w:rPr>
-                <w:sz w:val="20"/>
-              </w:rPr>
-              <w:t xml:space="preserve">Mi identificación operativa</w:t>
-            </w:r>
-          </w:p>
-        </w:tc>
-        <w:tc>
-          <w:p>
-            <w:r>
-              <w:rPr>
-                <w:sz w:val="20"/>
-              </w:rPr>
-              <w:t xml:space="preserve">_________________</w:t>
-            </w:r>
-          </w:p>
-        </w:tc>
-      </w:tr>
-      <w:tr>
-        <w:tc>
-          <w:p>
-            <w:r>
-              <w:rPr>
-                <w:sz w:val="20"/>
-              </w:rPr>
-              <w:t xml:space="preserve">Mi base/estación</w:t>
-            </w:r>
-          </w:p>
-        </w:tc>
-        <w:tc>
-          <w:p>
-            <w:r>
-              <w:rPr>
-                <w:sz w:val="20"/>
-              </w:rPr>
-              <w:t xml:space="preserve">_________________</w:t>
-            </w:r>
-          </w:p>
-        </w:tc>
-      </w:tr>
-      <w:tr>
-        <w:tc>
-          <w:p>
-            <w:r>
-              <w:rPr>
-                <w:sz w:val="20"/>
-              </w:rPr>
-              <w:t xml:space="preserve">Mi supervisor directo</w:t>
-            </w:r>
-          </w:p>
-        </w:tc>
-        <w:tc>
-          <w:p>
-            <w:r>
-              <w:rPr>
-                <w:sz w:val="20"/>
-              </w:rPr>
-              <w:t xml:space="preserve">_________________</w:t>
-            </w:r>
-          </w:p>
-        </w:tc>
-      </w:tr>
-      <w:tr>
-        <w:tc>
-          <w:p>
-            <w:r>
-              <w:rPr>
-                <w:sz w:val="20"/>
-              </w:rPr>
-              <w:t xml:space="preserve">Frecuencia radio principal</w:t>
-            </w:r>
-          </w:p>
-        </w:tc>
-        <w:tc>
-          <w:p>
-            <w:r>
-              <w:rPr>
-                <w:sz w:val="20"/>
-              </w:rPr>
-              <w:t xml:space="preserve">_________________</w:t>
-            </w:r>
-          </w:p>
-        </w:tc>
-      </w:tr>
-      <w:tr>
-        <w:tc>
-          <w:p>
-            <w:r>
-              <w:rPr>
-                <w:sz w:val="20"/>
-              </w:rPr>
-              <w:t xml:space="preserve">Frecuencia radio emergencia</w:t>
-            </w:r>
-          </w:p>
-        </w:tc>
-        <w:tc>
-          <w:p>
-            <w:r>
-              <w:rPr>
-                <w:sz w:val="20"/>
-              </w:rPr>
-              <w:t xml:space="preserve">_________________</w:t>
-            </w:r>
-          </w:p>
-        </w:tc>
-      </w:tr>
-      <w:tr>
-        <w:tc>
-          <w:p>
-            <w:r>
-              <w:rPr>
-                <w:sz w:val="20"/>
-              </w:rPr>
-              <w:t xml:space="preserve">Punto de reunión designado</w:t>
-            </w:r>
-          </w:p>
-        </w:tc>
-        <w:tc>
-          <w:p>
-            <w:r>
-              <w:rPr>
-                <w:sz w:val="20"/>
-              </w:rPr>
-              <w:t xml:space="preserve">_________________</w:t>
-            </w:r>
-          </w:p>
-        </w:tc>
-      </w:tr>
-    </w:tbl>
-    <w:p>
-      <w:r>
-        <w:t xml:space="preserve"/>
-      </w:r>
-    </w:p>
-    <w:p>
-      <w:r>
-        <w:t xml:space="preserve"/>
-      </w:r>
-    </w:p>
-    <w:p>
-      <w:r>
-        <w:rPr>
-          <w:color w:val="CCCCCC"/>
-        </w:rPr>
-        <w:t xml:space="preserve">────────────────────────────────────────────────────────────</w:t>
-      </w:r>
-    </w:p>
-    <w:p>
-      <w:r>
-        <w:t xml:space="preserve"/>
-      </w:r>
-    </w:p>
-    <w:p>
-      <w:r>
-        <w:t xml:space="preserve">Guía Rápida v1.0 - Julio 2026</w:t>
+      <w:r>
+        <w:t xml:space="preserve">Guía Rápida v2.0 - Colombia | Julio 2026</w:t>
       </w:r>
     </w:p>
     <w:p>

</xml_diff>